<commit_message>
Ports: replace Internal IP paragraph with Force LAN IP (VPN) section
Co-Authored-By: Claude Opus 5.5 <noreply@anthropic.com>
</commit_message>
<xml_diff>
--- a/Ports.docx
+++ b/Ports.docx
@@ -111,16 +111,23 @@
     </w:p>
     <w:p>
       <w:r>
-        <w:t xml:space="preserve">The Internal IP for regions should normally be 0.0.0.0. It is only used in </w:t>
-      </w:r>
-      <w:r>
-        <w:t>region</w:t>
-      </w:r>
-      <w:r>
-        <w:t xml:space="preserve"> servers. How it is used is in the manual “Servers</w:t>
-      </w:r>
-      <w:r>
-        <w:t>.”</w:t>
+        <w:rPr>
+          <w:b/>
+        </w:rPr>
+        <w:t xml:space="preserve">Force LAN IP (blank=auto): </w:t>
+      </w:r>
+      <w:r>
+        <w:t>Leave this blank, and DreamGrid finds your computer’s LAN address by itself. Most people never need to fill it in.</w:t>
+      </w:r>
+    </w:p>
+    <w:p>
+      <w:r>
+        <w:t>Fill it in if you use a VPN (such as Surfshark) or your computer has more than one network adapter. Those can make Windows send DreamGrid’s traffic the wrong way, and then visitors can’t reach your regions. Type your PC’s real LAN address, such as 192.168.2.160. Step 1 under Troubleshooting Ports shows how to find it.</w:t>
+      </w:r>
+    </w:p>
+    <w:p>
+      <w:r>
+        <w:t>When this box is filled in, your regions listen only on that address, and DreamGrid updates your grid’s DNS name through it. A VPN can’t take over either one. When it is blank, regions listen on every adapter (0.0.0.0). Restart DreamGrid after you change it.</w:t>
       </w:r>
     </w:p>
     <w:p>

</xml_diff>

<commit_message>
Ports: Word save during htm export
Co-Authored-By: Claude Opus 5.5 <noreply@anthropic.com>
</commit_message>
<xml_diff>
--- a/Ports.docx
+++ b/Ports.docx
@@ -68,7 +68,7 @@
             <v:path o:extrusionok="f" gradientshapeok="t" o:connecttype="rect"/>
             <o:lock v:ext="edit" aspectratio="t"/>
           </v:shapetype>
-          <v:shape id="Picture 1" o:spid="_x0000_i1025" type="#_x0000_t75" style="width:252pt;height:322.5pt;visibility:visible;mso-wrap-style:square">
+          <v:shape id="Picture 1" o:spid="_x0000_i1037" type="#_x0000_t75" style="width:252pt;height:322.5pt;visibility:visible;mso-wrap-style:square">
             <v:imagedata r:id="rId4" o:title=""/>
           </v:shape>
         </w:pict>
@@ -97,7 +97,15 @@
         <w:t xml:space="preserve">. </w:t>
       </w:r>
       <w:r>
-        <w:t xml:space="preserve">If you have manually added more regions, their region ports also need to be </w:t>
+        <w:t xml:space="preserve">If you </w:t>
+      </w:r>
+      <w:proofErr w:type="gramStart"/>
+      <w:r>
+        <w:t>have manually added</w:t>
+      </w:r>
+      <w:proofErr w:type="gramEnd"/>
+      <w:r>
+        <w:t xml:space="preserve"> more regions, their region ports also need to be </w:t>
       </w:r>
       <w:r>
         <w:t>port forwarded in the router</w:t>
@@ -106,7 +114,15 @@
         <w:t>.</w:t>
       </w:r>
       <w:r>
-        <w:t xml:space="preserve"> Each region that is used takes up one port. They start at 8004 and count up by one.</w:t>
+        <w:t xml:space="preserve"> Each region that is used takes up one port. They start at 8004 and </w:t>
+      </w:r>
+      <w:proofErr w:type="gramStart"/>
+      <w:r>
+        <w:t>count up</w:t>
+      </w:r>
+      <w:proofErr w:type="gramEnd"/>
+      <w:r>
+        <w:t xml:space="preserve"> by one.</w:t>
       </w:r>
     </w:p>
     <w:p>
@@ -122,12 +138,36 @@
     </w:p>
     <w:p>
       <w:r>
-        <w:t>Fill it in if you use a VPN (such as Surfshark) or your computer has more than one network adapter. Those can make Windows send DreamGrid’s traffic the wrong way, and then visitors can’t reach your regions. Type your PC’s real LAN address, such as 192.168.2.160. Step 1 under Troubleshooting Ports shows how to find it.</w:t>
-      </w:r>
-    </w:p>
-    <w:p>
-      <w:r>
-        <w:t>When this box is filled in, your regions listen only on that address, and DreamGrid updates your grid’s DNS name through it. A VPN can’t take over either one. When it is blank, regions listen on every adapter (0.0.0.0). Restart DreamGrid after you change it.</w:t>
+        <w:t xml:space="preserve">Fill it in if you use a VPN (such as Surfshark) or your computer has more than one network adapter. Those can make Windows send </w:t>
+      </w:r>
+      <w:proofErr w:type="spellStart"/>
+      <w:r>
+        <w:t>DreamGrid’s</w:t>
+      </w:r>
+      <w:proofErr w:type="spellEnd"/>
+      <w:r>
+        <w:t xml:space="preserve"> traffic the wrong way, and then visitors can’t reach your regions. Type your PC’s real LAN address, such as 192.168.2.160. Step 1 under Troubleshooting Ports shows how to find it.</w:t>
+      </w:r>
+    </w:p>
+    <w:p>
+      <w:r>
+        <w:t xml:space="preserve">When this box is filled in, your regions listen only </w:t>
+      </w:r>
+      <w:proofErr w:type="gramStart"/>
+      <w:r>
+        <w:t>on</w:t>
+      </w:r>
+      <w:proofErr w:type="gramEnd"/>
+      <w:r>
+        <w:t xml:space="preserve"> that address, and DreamGrid updates your grid’s DNS name through it. A VPN can’t take over either one. When it is blank, regions listen on every adapter (0.0.</w:t>
+      </w:r>
+      <w:proofErr w:type="gramStart"/>
+      <w:r>
+        <w:t>0.0</w:t>
+      </w:r>
+      <w:proofErr w:type="gramEnd"/>
+      <w:r>
+        <w:t>). Restart DreamGrid after you change it.</w:t>
       </w:r>
     </w:p>
     <w:p>
@@ -177,7 +217,6 @@
     </w:p>
     <w:p>
       <w:r>
-        <w:lastRenderedPageBreak/>
         <w:t xml:space="preserve">You may need to </w:t>
       </w:r>
       <w:r>
@@ -192,7 +231,15 @@
         <w:t xml:space="preserve">DreamGrid </w:t>
       </w:r>
       <w:r>
-        <w:t xml:space="preserve">will automatically open the correct ports. This can be slow and time-consuming, so you may prefer to disable UPnP and set your ports </w:t>
+        <w:t xml:space="preserve">will automatically open the correct ports. This can be slow and time-consuming, so you may prefer to disable UPnP and </w:t>
+      </w:r>
+      <w:proofErr w:type="gramStart"/>
+      <w:r>
+        <w:t>set</w:t>
+      </w:r>
+      <w:proofErr w:type="gramEnd"/>
+      <w:r>
+        <w:t xml:space="preserve"> your ports </w:t>
       </w:r>
       <w:r>
         <w:t>manually.</w:t>
@@ -247,7 +294,6 @@
     </w:p>
     <w:p>
       <w:r>
-        <w:lastRenderedPageBreak/>
         <w:pict w14:anchorId="6E61907A">
           <v:shape id="_x0000_i1027" type="#_x0000_t75" style="width:414pt;height:268.5pt">
             <v:imagedata r:id="rId6" o:title=""/>
@@ -280,7 +326,15 @@
         <w:t>Which ports?</w:t>
       </w:r>
       <w:r>
-        <w:t xml:space="preserve"> You need to Port-Forward 8001, 8002, and 8004-8010 (or higher, I usually open up to 8050) to have room for expansion. You can also add 8100 and 8101 for Shoutcast/Icecast.</w:t>
+        <w:t xml:space="preserve"> You need to Port-Forward 8001, 8002, and 8004-8010 (or higher, I usually </w:t>
+      </w:r>
+      <w:proofErr w:type="gramStart"/>
+      <w:r>
+        <w:t>open up</w:t>
+      </w:r>
+      <w:proofErr w:type="gramEnd"/>
+      <w:r>
+        <w:t xml:space="preserve"> to 8050) to have room for expansion. You can also add 8100 and 8101 for Shoutcast/Icecast.</w:t>
       </w:r>
       <w:r>
         <w:t xml:space="preserve"> </w:t>
@@ -314,7 +368,15 @@
         <w:t xml:space="preserve"> 8003 for security reasons.</w:t>
       </w:r>
       <w:r>
-        <w:t xml:space="preserve"> These can usually be done in ranges, like 8001-8002 and 8004-8010. The latter ones are for regions - you need one port per region, so this would let you have </w:t>
+        <w:t xml:space="preserve"> These can usually be done in ranges, like 8001-8002 and 8004-8010. The latter ones are </w:t>
+      </w:r>
+      <w:proofErr w:type="gramStart"/>
+      <w:r>
+        <w:t>for</w:t>
+      </w:r>
+      <w:proofErr w:type="gramEnd"/>
+      <w:r>
+        <w:t xml:space="preserve"> regions - you need one port per region, so this would let you have </w:t>
       </w:r>
       <w:r>
         <w:t>seven</w:t>
@@ -364,7 +426,15 @@
         <w:t>do not</w:t>
       </w:r>
       <w:r>
-        <w:t xml:space="preserve"> have a Both or All option, you have to add them twice, once for UDP and once for TCP.</w:t>
+        <w:t xml:space="preserve"> have a Both or All option, you </w:t>
+      </w:r>
+      <w:proofErr w:type="gramStart"/>
+      <w:r>
+        <w:t>have to</w:t>
+      </w:r>
+      <w:proofErr w:type="gramEnd"/>
+      <w:r>
+        <w:t xml:space="preserve"> add them twice, once for UDP and once for TCP.</w:t>
       </w:r>
     </w:p>
     <w:p>
@@ -376,7 +446,15 @@
         <w:t>How do I know this worked?</w:t>
       </w:r>
       <w:r>
-        <w:t> You can tell if it worked by starting Opensimulator, and then use a web browser to go to </w:t>
+        <w:t xml:space="preserve"> You can tell if it worked by starting </w:t>
+      </w:r>
+      <w:proofErr w:type="gramStart"/>
+      <w:r>
+        <w:t>Opensimulator, and</w:t>
+      </w:r>
+      <w:proofErr w:type="gramEnd"/>
+      <w:r>
+        <w:t xml:space="preserve"> then use a web browser to go to </w:t>
       </w:r>
       <w:hyperlink r:id="rId7" w:history="1">
         <w:r>
@@ -414,7 +492,6 @@
     </w:p>
     <w:p>
       <w:r>
-        <w:lastRenderedPageBreak/>
         <w:t xml:space="preserve">See </w:t>
       </w:r>
       <w:r>
@@ -537,7 +614,15 @@
     </w:p>
     <w:p>
       <w:r>
-        <w:t xml:space="preserve">Windows will prompt you to allow Opensim to open ports when it first runs. If you say no, you will not be able to log </w:t>
+        <w:t xml:space="preserve">Windows will prompt you to allow </w:t>
+      </w:r>
+      <w:proofErr w:type="gramStart"/>
+      <w:r>
+        <w:t>Opensim to open</w:t>
+      </w:r>
+      <w:proofErr w:type="gramEnd"/>
+      <w:r>
+        <w:t xml:space="preserve"> ports when it first runs. If you say no, you will not be able to log </w:t>
       </w:r>
       <w:r>
         <w:t xml:space="preserve">in. </w:t>
@@ -631,9 +716,6 @@
       </w:r>
       <w:r>
         <w:br/>
-      </w:r>
-      <w:r>
-        <w:lastRenderedPageBreak/>
         <w:t>7. Key in the port number, the port is 8001-8010 (or higher for more regions)</w:t>
       </w:r>
       <w:r>
@@ -673,7 +755,15 @@
         <w:t>3</w:t>
       </w:r>
       <w:r>
-        <w:t xml:space="preserve">. Repeat the above but using UDP from step </w:t>
+        <w:t xml:space="preserve">. Repeat the above but </w:t>
+      </w:r>
+      <w:proofErr w:type="gramStart"/>
+      <w:r>
+        <w:t>using</w:t>
+      </w:r>
+      <w:proofErr w:type="gramEnd"/>
+      <w:r>
+        <w:t xml:space="preserve"> UDP from step </w:t>
       </w:r>
       <w:r>
         <w:t>6.</w:t>
@@ -697,7 +787,21 @@
         <w:rPr>
           <w:highlight w:val="white"/>
         </w:rPr>
-        <w:t>Here is more detail about ports and the way the interact with the outside world such as </w:t>
+        <w:t xml:space="preserve">Here is more detail about ports and the way </w:t>
+      </w:r>
+      <w:proofErr w:type="gramStart"/>
+      <w:r>
+        <w:rPr>
+          <w:highlight w:val="white"/>
+        </w:rPr>
+        <w:t>the</w:t>
+      </w:r>
+      <w:proofErr w:type="gramEnd"/>
+      <w:r>
+        <w:rPr>
+          <w:highlight w:val="white"/>
+        </w:rPr>
+        <w:t xml:space="preserve"> interact with the outside world such as </w:t>
       </w:r>
       <w:hyperlink r:id="rId12" w:history="1">
         <w:r>
@@ -773,7 +877,15 @@
         <w:t>answers</w:t>
       </w:r>
       <w:r>
-        <w:t xml:space="preserve"> http:// GET and POST requests on 8002. Port 8002 is like port 80, the default port for web pages. You can actually set Dreamworld's 8002 port to 80, and it will still work. You can then drop the need to type :8002 at the end of your hyperlink. </w:t>
+        <w:t xml:space="preserve"> http:// GET and POST requests on 8002. Port 8002 is like port 80, the default port for web pages. You can </w:t>
+      </w:r>
+      <w:proofErr w:type="gramStart"/>
+      <w:r>
+        <w:t>actually set</w:t>
+      </w:r>
+      <w:proofErr w:type="gramEnd"/>
+      <w:r>
+        <w:t xml:space="preserve"> Dreamworld's 8002 port to 80, and it will still work. You can then drop the need to type :8002 at the end of your hyperlink. </w:t>
       </w:r>
       <w:hyperlink r:id="rId14" w:history="1">
         <w:r>
@@ -815,11 +927,6 @@
       </w:r>
     </w:p>
     <w:p>
-      <w:r>
-        <w:br w:type="page"/>
-      </w:r>
-    </w:p>
-    <w:p>
       <w:pPr>
         <w:pStyle w:val="Heading3"/>
       </w:pPr>
@@ -854,16 +961,38 @@
       </w:r>
     </w:p>
     <w:p>
-      <w:r>
+      <w:pPr>
+        <w:rPr>
+          <w:b/>
+          <w:bCs/>
+        </w:rPr>
+      </w:pPr>
+      <w:r>
+        <w:rPr>
+          <w:b/>
+          <w:bCs/>
+        </w:rPr>
         <w:t xml:space="preserve">If you opened port 8003 to anyone on the web, you expose the internal database protocol to the web. Anyone with the right knowledge could attach a region to your sim. If you run </w:t>
       </w:r>
       <w:r>
+        <w:rPr>
+          <w:b/>
+          <w:bCs/>
+        </w:rPr>
         <w:t>DreamGrid</w:t>
       </w:r>
       <w:r>
+        <w:rPr>
+          <w:b/>
+          <w:bCs/>
+        </w:rPr>
         <w:t xml:space="preserve"> </w:t>
       </w:r>
       <w:r>
+        <w:rPr>
+          <w:b/>
+          <w:bCs/>
+        </w:rPr>
         <w:t>and host regions outside your LAN, it is recommended you use firewall rules to only allow access from known IP addresses running approved regions.</w:t>
       </w:r>
     </w:p>
@@ -888,7 +1017,15 @@
     </w:p>
     <w:p>
       <w:r>
-        <w:t>For multiple regions in a single DOS box, all regions listen for TCP traffic on the last port used in that DOS box</w:t>
+        <w:t xml:space="preserve">For multiple regions in a single DOS box, all regions listen </w:t>
+      </w:r>
+      <w:proofErr w:type="gramStart"/>
+      <w:r>
+        <w:t>for</w:t>
+      </w:r>
+      <w:proofErr w:type="gramEnd"/>
+      <w:r>
+        <w:t xml:space="preserve"> TCP traffic on the last port used in that DOS box</w:t>
       </w:r>
       <w:r>
         <w:t xml:space="preserve">. </w:t>

</xml_diff>